<commit_message>
Keep the embedded tables in sync with the analysis
BMJ requires tables in the main text at first citation, so they are
embedded in manuscript.md - but they are generated by analysis.py, and
the embedded copies were a snapshot. Re-running the analysis silently
left the manuscript with stale tables: the newly added CO2e column
existed in tables/ but not in the manuscript or the .docx.

sync_tables.py now rewrites each embedded block from the generated file
and fails loudly if a block cannot be located, so the manuscript cannot
drift from the analysis again. Run it after analysis.py and before
build_docx.js.

Also moves the table 3 preamble into a proper footnote, collapses two
doubled horizontal rules, and fixes the word count, which was counting
table footnotes as body text.

Co-Authored-By: Claude Opus 5 <noreply@anthropic.com>
Claude-Session: https://claude.ai/code/session_01SHGvgn1XeZPuGWHj4pB41h
</commit_message>
<xml_diff>
--- a/manuscripts/obstetric-paper-burden/BMJ-HCI-submission.docx
+++ b/manuscripts/obstetric-paper-burden/BMJ-HCI-submission.docx
@@ -58,7 +58,7 @@
         <w:t xml:space="preserve">Word count</w:t>
       </w:r>
       <w:r>
-        <w:t xml:space="preserve"> Abstract 358; main text 5,275 excluding abstract, tables, statements, references and figure legends.</w:t>
+        <w:t xml:space="preserve"> Abstract 358; main text 5,281 excluding abstract, tables, statements, references and figure legends.</w:t>
       </w:r>
     </w:p>
     <w:p>
@@ -241,14 +241,6 @@
       <w:r>
         <w:t xml:space="preserve"> (MeSH) Medical Records; Prenatal Care; Documentation; Costs and Cost Analysis; Health Information Exchange; Paper</w:t>
       </w:r>
-    </w:p>
-    <w:p>
-      <w:pPr>
-        <w:pBdr>
-          <w:bottom w:val="single" w:color="CCCCCC" w:sz="6"/>
-        </w:pBdr>
-        <w:spacing w:after="200" w:before="200"/>
-      </w:pPr>
     </w:p>
     <w:p>
       <w:pPr>
@@ -425,14 +417,6 @@
       <w:r>
         <w:t xml:space="preserve">The retention policy is an economic decision distinct from the printing policy, and the two should be appraised separately.</w:t>
       </w:r>
-    </w:p>
-    <w:p>
-      <w:pPr>
-        <w:pBdr>
-          <w:bottom w:val="single" w:color="CCCCCC" w:sz="6"/>
-        </w:pBdr>
-        <w:spacing w:after="200" w:before="200"/>
-      </w:pPr>
     </w:p>
     <w:p>
       <w:pPr>
@@ -3457,16 +3441,17 @@
         </w:tblBorders>
       </w:tblPr>
       <w:tblGrid>
-        <w:gridCol w:w="902"/>
-        <w:gridCol w:w="902"/>
-        <w:gridCol w:w="902"/>
-        <w:gridCol w:w="902"/>
-        <w:gridCol w:w="902"/>
-        <w:gridCol w:w="902"/>
-        <w:gridCol w:w="902"/>
-        <w:gridCol w:w="902"/>
-        <w:gridCol w:w="902"/>
-        <w:gridCol w:w="908"/>
+        <w:gridCol w:w="820"/>
+        <w:gridCol w:w="820"/>
+        <w:gridCol w:w="820"/>
+        <w:gridCol w:w="820"/>
+        <w:gridCol w:w="820"/>
+        <w:gridCol w:w="820"/>
+        <w:gridCol w:w="820"/>
+        <w:gridCol w:w="820"/>
+        <w:gridCol w:w="820"/>
+        <w:gridCol w:w="820"/>
+        <w:gridCol w:w="826"/>
       </w:tblGrid>
       <w:tr>
         <w:trPr>
@@ -3474,7 +3459,7 @@
         </w:trPr>
         <w:tc>
           <w:tcPr>
-            <w:tcW w:type="dxa" w:w="902"/>
+            <w:tcW w:type="dxa" w:w="820"/>
             <w:shd w:fill="F2F2F2" w:val="clear"/>
             <w:tcMar>
               <w:top w:type="dxa" w:w="60"/>
@@ -3500,7 +3485,7 @@
         </w:tc>
         <w:tc>
           <w:tcPr>
-            <w:tcW w:type="dxa" w:w="902"/>
+            <w:tcW w:type="dxa" w:w="820"/>
             <w:shd w:fill="F2F2F2" w:val="clear"/>
             <w:tcMar>
               <w:top w:type="dxa" w:w="60"/>
@@ -3526,7 +3511,7 @@
         </w:tc>
         <w:tc>
           <w:tcPr>
-            <w:tcW w:type="dxa" w:w="902"/>
+            <w:tcW w:type="dxa" w:w="820"/>
             <w:shd w:fill="F2F2F2" w:val="clear"/>
             <w:tcMar>
               <w:top w:type="dxa" w:w="60"/>
@@ -3552,7 +3537,7 @@
         </w:tc>
         <w:tc>
           <w:tcPr>
-            <w:tcW w:type="dxa" w:w="902"/>
+            <w:tcW w:type="dxa" w:w="820"/>
             <w:shd w:fill="F2F2F2" w:val="clear"/>
             <w:tcMar>
               <w:top w:type="dxa" w:w="60"/>
@@ -3578,7 +3563,7 @@
         </w:tc>
         <w:tc>
           <w:tcPr>
-            <w:tcW w:type="dxa" w:w="902"/>
+            <w:tcW w:type="dxa" w:w="820"/>
             <w:shd w:fill="F2F2F2" w:val="clear"/>
             <w:tcMar>
               <w:top w:type="dxa" w:w="60"/>
@@ -3604,7 +3589,7 @@
         </w:tc>
         <w:tc>
           <w:tcPr>
-            <w:tcW w:type="dxa" w:w="902"/>
+            <w:tcW w:type="dxa" w:w="820"/>
             <w:shd w:fill="F2F2F2" w:val="clear"/>
             <w:tcMar>
               <w:top w:type="dxa" w:w="60"/>
@@ -3624,13 +3609,13 @@
                 <w:sz w:val="18"/>
                 <w:szCs w:val="18"/>
               </w:rPr>
-              <w:t xml:space="preserve">Consumables (HUF/y, net)</w:t>
-            </w:r>
-          </w:p>
-        </w:tc>
-        <w:tc>
-          <w:tcPr>
-            <w:tcW w:type="dxa" w:w="902"/>
+              <w:t xml:space="preserve">CO2e (t/y)</w:t>
+            </w:r>
+          </w:p>
+        </w:tc>
+        <w:tc>
+          <w:tcPr>
+            <w:tcW w:type="dxa" w:w="820"/>
             <w:shd w:fill="F2F2F2" w:val="clear"/>
             <w:tcMar>
               <w:top w:type="dxa" w:w="60"/>
@@ -3650,13 +3635,13 @@
                 <w:sz w:val="18"/>
                 <w:szCs w:val="18"/>
               </w:rPr>
-              <w:t xml:space="preserve">Handling (h/y)</w:t>
-            </w:r>
-          </w:p>
-        </w:tc>
-        <w:tc>
-          <w:tcPr>
-            <w:tcW w:type="dxa" w:w="902"/>
+              <w:t xml:space="preserve">Consumables (HUF/y, net)</w:t>
+            </w:r>
+          </w:p>
+        </w:tc>
+        <w:tc>
+          <w:tcPr>
+            <w:tcW w:type="dxa" w:w="820"/>
             <w:shd w:fill="F2F2F2" w:val="clear"/>
             <w:tcMar>
               <w:top w:type="dxa" w:w="60"/>
@@ -3676,13 +3661,13 @@
                 <w:sz w:val="18"/>
                 <w:szCs w:val="18"/>
               </w:rPr>
-              <w:t xml:space="preserve">Handling (FTE)</w:t>
-            </w:r>
-          </w:p>
-        </w:tc>
-        <w:tc>
-          <w:tcPr>
-            <w:tcW w:type="dxa" w:w="902"/>
+              <w:t xml:space="preserve">Handling (h/y)</w:t>
+            </w:r>
+          </w:p>
+        </w:tc>
+        <w:tc>
+          <w:tcPr>
+            <w:tcW w:type="dxa" w:w="820"/>
             <w:shd w:fill="F2F2F2" w:val="clear"/>
             <w:tcMar>
               <w:top w:type="dxa" w:w="60"/>
@@ -3702,13 +3687,39 @@
                 <w:sz w:val="18"/>
                 <w:szCs w:val="18"/>
               </w:rPr>
+              <w:t xml:space="preserve">Handling (FTE)</w:t>
+            </w:r>
+          </w:p>
+        </w:tc>
+        <w:tc>
+          <w:tcPr>
+            <w:tcW w:type="dxa" w:w="820"/>
+            <w:shd w:fill="F2F2F2" w:val="clear"/>
+            <w:tcMar>
+              <w:top w:type="dxa" w:w="60"/>
+              <w:left w:type="dxa" w:w="80"/>
+              <w:bottom w:type="dxa" w:w="60"/>
+              <w:right w:type="dxa" w:w="80"/>
+            </w:tcMar>
+          </w:tcPr>
+          <w:p>
+            <w:pPr>
+              <w:spacing w:after="0" w:line="240"/>
+            </w:pPr>
+            <w:r>
+              <w:rPr>
+                <w:b/>
+                <w:bCs/>
+                <w:sz w:val="18"/>
+                <w:szCs w:val="18"/>
+              </w:rPr>
               <w:t xml:space="preserve">Archive floor (m²)</w:t>
             </w:r>
           </w:p>
         </w:tc>
         <w:tc>
           <w:tcPr>
-            <w:tcW w:type="dxa" w:w="908"/>
+            <w:tcW w:type="dxa" w:w="826"/>
             <w:shd w:fill="F2F2F2" w:val="clear"/>
             <w:tcMar>
               <w:top w:type="dxa" w:w="60"/>
@@ -3739,7 +3750,7 @@
         </w:trPr>
         <w:tc>
           <w:tcPr>
-            <w:tcW w:type="dxa" w:w="902"/>
+            <w:tcW w:type="dxa" w:w="820"/>
             <w:tcMar>
               <w:top w:type="dxa" w:w="60"/>
               <w:left w:type="dxa" w:w="80"/>
@@ -3764,7 +3775,7 @@
         </w:tc>
         <w:tc>
           <w:tcPr>
-            <w:tcW w:type="dxa" w:w="902"/>
+            <w:tcW w:type="dxa" w:w="820"/>
             <w:tcMar>
               <w:top w:type="dxa" w:w="60"/>
               <w:left w:type="dxa" w:w="80"/>
@@ -3789,7 +3800,7 @@
         </w:tc>
         <w:tc>
           <w:tcPr>
-            <w:tcW w:type="dxa" w:w="902"/>
+            <w:tcW w:type="dxa" w:w="820"/>
             <w:tcMar>
               <w:top w:type="dxa" w:w="60"/>
               <w:left w:type="dxa" w:w="80"/>
@@ -3814,7 +3825,7 @@
         </w:tc>
         <w:tc>
           <w:tcPr>
-            <w:tcW w:type="dxa" w:w="902"/>
+            <w:tcW w:type="dxa" w:w="820"/>
             <w:tcMar>
               <w:top w:type="dxa" w:w="60"/>
               <w:left w:type="dxa" w:w="80"/>
@@ -3839,7 +3850,7 @@
         </w:tc>
         <w:tc>
           <w:tcPr>
-            <w:tcW w:type="dxa" w:w="902"/>
+            <w:tcW w:type="dxa" w:w="820"/>
             <w:tcMar>
               <w:top w:type="dxa" w:w="60"/>
               <w:left w:type="dxa" w:w="80"/>
@@ -3864,7 +3875,7 @@
         </w:tc>
         <w:tc>
           <w:tcPr>
-            <w:tcW w:type="dxa" w:w="902"/>
+            <w:tcW w:type="dxa" w:w="820"/>
             <w:tcMar>
               <w:top w:type="dxa" w:w="60"/>
               <w:left w:type="dxa" w:w="80"/>
@@ -3889,7 +3900,7 @@
         </w:tc>
         <w:tc>
           <w:tcPr>
-            <w:tcW w:type="dxa" w:w="902"/>
+            <w:tcW w:type="dxa" w:w="820"/>
             <w:tcMar>
               <w:top w:type="dxa" w:w="60"/>
               <w:left w:type="dxa" w:w="80"/>
@@ -3914,7 +3925,7 @@
         </w:tc>
         <w:tc>
           <w:tcPr>
-            <w:tcW w:type="dxa" w:w="902"/>
+            <w:tcW w:type="dxa" w:w="820"/>
             <w:tcMar>
               <w:top w:type="dxa" w:w="60"/>
               <w:left w:type="dxa" w:w="80"/>
@@ -3939,7 +3950,7 @@
         </w:tc>
         <w:tc>
           <w:tcPr>
-            <w:tcW w:type="dxa" w:w="902"/>
+            <w:tcW w:type="dxa" w:w="820"/>
             <w:tcMar>
               <w:top w:type="dxa" w:w="60"/>
               <w:left w:type="dxa" w:w="80"/>
@@ -3964,7 +3975,32 @@
         </w:tc>
         <w:tc>
           <w:tcPr>
-            <w:tcW w:type="dxa" w:w="908"/>
+            <w:tcW w:type="dxa" w:w="820"/>
+            <w:tcMar>
+              <w:top w:type="dxa" w:w="60"/>
+              <w:left w:type="dxa" w:w="80"/>
+              <w:bottom w:type="dxa" w:w="60"/>
+              <w:right w:type="dxa" w:w="80"/>
+            </w:tcMar>
+          </w:tcPr>
+          <w:p>
+            <w:pPr>
+              <w:spacing w:after="0" w:line="240"/>
+            </w:pPr>
+            <w:r>
+              <w:rPr>
+                <w:b/>
+                <w:bCs/>
+                <w:sz w:val="18"/>
+                <w:szCs w:val="18"/>
+              </w:rPr>
+              <w:t xml:space="preserve"/>
+            </w:r>
+          </w:p>
+        </w:tc>
+        <w:tc>
+          <w:tcPr>
+            <w:tcW w:type="dxa" w:w="826"/>
             <w:tcMar>
               <w:top w:type="dxa" w:w="60"/>
               <w:left w:type="dxa" w:w="80"/>
@@ -3994,7 +4030,7 @@
         </w:trPr>
         <w:tc>
           <w:tcPr>
-            <w:tcW w:type="dxa" w:w="902"/>
+            <w:tcW w:type="dxa" w:w="820"/>
             <w:tcMar>
               <w:top w:type="dxa" w:w="60"/>
               <w:left w:type="dxa" w:w="80"/>
@@ -4019,7 +4055,7 @@
         </w:tc>
         <w:tc>
           <w:tcPr>
-            <w:tcW w:type="dxa" w:w="902"/>
+            <w:tcW w:type="dxa" w:w="820"/>
             <w:tcMar>
               <w:top w:type="dxa" w:w="60"/>
               <w:left w:type="dxa" w:w="80"/>
@@ -4044,7 +4080,7 @@
         </w:tc>
         <w:tc>
           <w:tcPr>
-            <w:tcW w:type="dxa" w:w="902"/>
+            <w:tcW w:type="dxa" w:w="820"/>
             <w:tcMar>
               <w:top w:type="dxa" w:w="60"/>
               <w:left w:type="dxa" w:w="80"/>
@@ -4069,7 +4105,7 @@
         </w:tc>
         <w:tc>
           <w:tcPr>
-            <w:tcW w:type="dxa" w:w="902"/>
+            <w:tcW w:type="dxa" w:w="820"/>
             <w:tcMar>
               <w:top w:type="dxa" w:w="60"/>
               <w:left w:type="dxa" w:w="80"/>
@@ -4094,7 +4130,7 @@
         </w:tc>
         <w:tc>
           <w:tcPr>
-            <w:tcW w:type="dxa" w:w="902"/>
+            <w:tcW w:type="dxa" w:w="820"/>
             <w:tcMar>
               <w:top w:type="dxa" w:w="60"/>
               <w:left w:type="dxa" w:w="80"/>
@@ -4119,7 +4155,32 @@
         </w:tc>
         <w:tc>
           <w:tcPr>
-            <w:tcW w:type="dxa" w:w="902"/>
+            <w:tcW w:type="dxa" w:w="820"/>
+            <w:tcMar>
+              <w:top w:type="dxa" w:w="60"/>
+              <w:left w:type="dxa" w:w="80"/>
+              <w:bottom w:type="dxa" w:w="60"/>
+              <w:right w:type="dxa" w:w="80"/>
+            </w:tcMar>
+          </w:tcPr>
+          <w:p>
+            <w:pPr>
+              <w:spacing w:after="0" w:line="240"/>
+            </w:pPr>
+            <w:r>
+              <w:rPr>
+                <w:b w:val="false"/>
+                <w:bCs w:val="false"/>
+                <w:sz w:val="18"/>
+                <w:szCs w:val="18"/>
+              </w:rPr>
+              <w:t xml:space="preserve">1.2</w:t>
+            </w:r>
+          </w:p>
+        </w:tc>
+        <w:tc>
+          <w:tcPr>
+            <w:tcW w:type="dxa" w:w="820"/>
             <w:tcMar>
               <w:top w:type="dxa" w:w="60"/>
               <w:left w:type="dxa" w:w="80"/>
@@ -4144,7 +4205,7 @@
         </w:tc>
         <w:tc>
           <w:tcPr>
-            <w:tcW w:type="dxa" w:w="902"/>
+            <w:tcW w:type="dxa" w:w="820"/>
             <w:tcMar>
               <w:top w:type="dxa" w:w="60"/>
               <w:left w:type="dxa" w:w="80"/>
@@ -4169,7 +4230,7 @@
         </w:tc>
         <w:tc>
           <w:tcPr>
-            <w:tcW w:type="dxa" w:w="902"/>
+            <w:tcW w:type="dxa" w:w="820"/>
             <w:tcMar>
               <w:top w:type="dxa" w:w="60"/>
               <w:left w:type="dxa" w:w="80"/>
@@ -4194,7 +4255,7 @@
         </w:tc>
         <w:tc>
           <w:tcPr>
-            <w:tcW w:type="dxa" w:w="902"/>
+            <w:tcW w:type="dxa" w:w="820"/>
             <w:tcMar>
               <w:top w:type="dxa" w:w="60"/>
               <w:left w:type="dxa" w:w="80"/>
@@ -4219,7 +4280,7 @@
         </w:tc>
         <w:tc>
           <w:tcPr>
-            <w:tcW w:type="dxa" w:w="908"/>
+            <w:tcW w:type="dxa" w:w="826"/>
             <w:tcMar>
               <w:top w:type="dxa" w:w="60"/>
               <w:left w:type="dxa" w:w="80"/>
@@ -4249,7 +4310,7 @@
         </w:trPr>
         <w:tc>
           <w:tcPr>
-            <w:tcW w:type="dxa" w:w="902"/>
+            <w:tcW w:type="dxa" w:w="820"/>
             <w:tcMar>
               <w:top w:type="dxa" w:w="60"/>
               <w:left w:type="dxa" w:w="80"/>
@@ -4274,7 +4335,7 @@
         </w:tc>
         <w:tc>
           <w:tcPr>
-            <w:tcW w:type="dxa" w:w="902"/>
+            <w:tcW w:type="dxa" w:w="820"/>
             <w:tcMar>
               <w:top w:type="dxa" w:w="60"/>
               <w:left w:type="dxa" w:w="80"/>
@@ -4299,7 +4360,7 @@
         </w:tc>
         <w:tc>
           <w:tcPr>
-            <w:tcW w:type="dxa" w:w="902"/>
+            <w:tcW w:type="dxa" w:w="820"/>
             <w:tcMar>
               <w:top w:type="dxa" w:w="60"/>
               <w:left w:type="dxa" w:w="80"/>
@@ -4324,7 +4385,7 @@
         </w:tc>
         <w:tc>
           <w:tcPr>
-            <w:tcW w:type="dxa" w:w="902"/>
+            <w:tcW w:type="dxa" w:w="820"/>
             <w:tcMar>
               <w:top w:type="dxa" w:w="60"/>
               <w:left w:type="dxa" w:w="80"/>
@@ -4349,7 +4410,7 @@
         </w:tc>
         <w:tc>
           <w:tcPr>
-            <w:tcW w:type="dxa" w:w="902"/>
+            <w:tcW w:type="dxa" w:w="820"/>
             <w:tcMar>
               <w:top w:type="dxa" w:w="60"/>
               <w:left w:type="dxa" w:w="80"/>
@@ -4374,7 +4435,32 @@
         </w:tc>
         <w:tc>
           <w:tcPr>
-            <w:tcW w:type="dxa" w:w="902"/>
+            <w:tcW w:type="dxa" w:w="820"/>
+            <w:tcMar>
+              <w:top w:type="dxa" w:w="60"/>
+              <w:left w:type="dxa" w:w="80"/>
+              <w:bottom w:type="dxa" w:w="60"/>
+              <w:right w:type="dxa" w:w="80"/>
+            </w:tcMar>
+          </w:tcPr>
+          <w:p>
+            <w:pPr>
+              <w:spacing w:after="0" w:line="240"/>
+            </w:pPr>
+            <w:r>
+              <w:rPr>
+                <w:b w:val="false"/>
+                <w:bCs w:val="false"/>
+                <w:sz w:val="18"/>
+                <w:szCs w:val="18"/>
+              </w:rPr>
+              <w:t xml:space="preserve">0.6</w:t>
+            </w:r>
+          </w:p>
+        </w:tc>
+        <w:tc>
+          <w:tcPr>
+            <w:tcW w:type="dxa" w:w="820"/>
             <w:tcMar>
               <w:top w:type="dxa" w:w="60"/>
               <w:left w:type="dxa" w:w="80"/>
@@ -4399,7 +4485,7 @@
         </w:tc>
         <w:tc>
           <w:tcPr>
-            <w:tcW w:type="dxa" w:w="902"/>
+            <w:tcW w:type="dxa" w:w="820"/>
             <w:tcMar>
               <w:top w:type="dxa" w:w="60"/>
               <w:left w:type="dxa" w:w="80"/>
@@ -4424,7 +4510,7 @@
         </w:tc>
         <w:tc>
           <w:tcPr>
-            <w:tcW w:type="dxa" w:w="902"/>
+            <w:tcW w:type="dxa" w:w="820"/>
             <w:tcMar>
               <w:top w:type="dxa" w:w="60"/>
               <w:left w:type="dxa" w:w="80"/>
@@ -4449,7 +4535,7 @@
         </w:tc>
         <w:tc>
           <w:tcPr>
-            <w:tcW w:type="dxa" w:w="902"/>
+            <w:tcW w:type="dxa" w:w="820"/>
             <w:tcMar>
               <w:top w:type="dxa" w:w="60"/>
               <w:left w:type="dxa" w:w="80"/>
@@ -4474,7 +4560,7 @@
         </w:tc>
         <w:tc>
           <w:tcPr>
-            <w:tcW w:type="dxa" w:w="908"/>
+            <w:tcW w:type="dxa" w:w="826"/>
             <w:tcMar>
               <w:top w:type="dxa" w:w="60"/>
               <w:left w:type="dxa" w:w="80"/>
@@ -4504,7 +4590,7 @@
         </w:trPr>
         <w:tc>
           <w:tcPr>
-            <w:tcW w:type="dxa" w:w="902"/>
+            <w:tcW w:type="dxa" w:w="820"/>
             <w:tcMar>
               <w:top w:type="dxa" w:w="60"/>
               <w:left w:type="dxa" w:w="80"/>
@@ -4529,7 +4615,7 @@
         </w:tc>
         <w:tc>
           <w:tcPr>
-            <w:tcW w:type="dxa" w:w="902"/>
+            <w:tcW w:type="dxa" w:w="820"/>
             <w:tcMar>
               <w:top w:type="dxa" w:w="60"/>
               <w:left w:type="dxa" w:w="80"/>
@@ -4554,7 +4640,7 @@
         </w:tc>
         <w:tc>
           <w:tcPr>
-            <w:tcW w:type="dxa" w:w="902"/>
+            <w:tcW w:type="dxa" w:w="820"/>
             <w:tcMar>
               <w:top w:type="dxa" w:w="60"/>
               <w:left w:type="dxa" w:w="80"/>
@@ -4579,7 +4665,7 @@
         </w:tc>
         <w:tc>
           <w:tcPr>
-            <w:tcW w:type="dxa" w:w="902"/>
+            <w:tcW w:type="dxa" w:w="820"/>
             <w:tcMar>
               <w:top w:type="dxa" w:w="60"/>
               <w:left w:type="dxa" w:w="80"/>
@@ -4604,7 +4690,7 @@
         </w:tc>
         <w:tc>
           <w:tcPr>
-            <w:tcW w:type="dxa" w:w="902"/>
+            <w:tcW w:type="dxa" w:w="820"/>
             <w:tcMar>
               <w:top w:type="dxa" w:w="60"/>
               <w:left w:type="dxa" w:w="80"/>
@@ -4629,7 +4715,32 @@
         </w:tc>
         <w:tc>
           <w:tcPr>
-            <w:tcW w:type="dxa" w:w="902"/>
+            <w:tcW w:type="dxa" w:w="820"/>
+            <w:tcMar>
+              <w:top w:type="dxa" w:w="60"/>
+              <w:left w:type="dxa" w:w="80"/>
+              <w:bottom w:type="dxa" w:w="60"/>
+              <w:right w:type="dxa" w:w="80"/>
+            </w:tcMar>
+          </w:tcPr>
+          <w:p>
+            <w:pPr>
+              <w:spacing w:after="0" w:line="240"/>
+            </w:pPr>
+            <w:r>
+              <w:rPr>
+                <w:b w:val="false"/>
+                <w:bCs w:val="false"/>
+                <w:sz w:val="18"/>
+                <w:szCs w:val="18"/>
+              </w:rPr>
+              <w:t xml:space="preserve">0.3</w:t>
+            </w:r>
+          </w:p>
+        </w:tc>
+        <w:tc>
+          <w:tcPr>
+            <w:tcW w:type="dxa" w:w="820"/>
             <w:tcMar>
               <w:top w:type="dxa" w:w="60"/>
               <w:left w:type="dxa" w:w="80"/>
@@ -4654,7 +4765,7 @@
         </w:tc>
         <w:tc>
           <w:tcPr>
-            <w:tcW w:type="dxa" w:w="902"/>
+            <w:tcW w:type="dxa" w:w="820"/>
             <w:tcMar>
               <w:top w:type="dxa" w:w="60"/>
               <w:left w:type="dxa" w:w="80"/>
@@ -4679,7 +4790,7 @@
         </w:tc>
         <w:tc>
           <w:tcPr>
-            <w:tcW w:type="dxa" w:w="902"/>
+            <w:tcW w:type="dxa" w:w="820"/>
             <w:tcMar>
               <w:top w:type="dxa" w:w="60"/>
               <w:left w:type="dxa" w:w="80"/>
@@ -4704,7 +4815,7 @@
         </w:tc>
         <w:tc>
           <w:tcPr>
-            <w:tcW w:type="dxa" w:w="902"/>
+            <w:tcW w:type="dxa" w:w="820"/>
             <w:tcMar>
               <w:top w:type="dxa" w:w="60"/>
               <w:left w:type="dxa" w:w="80"/>
@@ -4729,7 +4840,7 @@
         </w:tc>
         <w:tc>
           <w:tcPr>
-            <w:tcW w:type="dxa" w:w="908"/>
+            <w:tcW w:type="dxa" w:w="826"/>
             <w:tcMar>
               <w:top w:type="dxa" w:w="60"/>
               <w:left w:type="dxa" w:w="80"/>
@@ -4759,7 +4870,7 @@
         </w:trPr>
         <w:tc>
           <w:tcPr>
-            <w:tcW w:type="dxa" w:w="902"/>
+            <w:tcW w:type="dxa" w:w="820"/>
             <w:tcMar>
               <w:top w:type="dxa" w:w="60"/>
               <w:left w:type="dxa" w:w="80"/>
@@ -4784,7 +4895,7 @@
         </w:tc>
         <w:tc>
           <w:tcPr>
-            <w:tcW w:type="dxa" w:w="902"/>
+            <w:tcW w:type="dxa" w:w="820"/>
             <w:tcMar>
               <w:top w:type="dxa" w:w="60"/>
               <w:left w:type="dxa" w:w="80"/>
@@ -4809,7 +4920,7 @@
         </w:tc>
         <w:tc>
           <w:tcPr>
-            <w:tcW w:type="dxa" w:w="902"/>
+            <w:tcW w:type="dxa" w:w="820"/>
             <w:tcMar>
               <w:top w:type="dxa" w:w="60"/>
               <w:left w:type="dxa" w:w="80"/>
@@ -4834,7 +4945,7 @@
         </w:tc>
         <w:tc>
           <w:tcPr>
-            <w:tcW w:type="dxa" w:w="902"/>
+            <w:tcW w:type="dxa" w:w="820"/>
             <w:tcMar>
               <w:top w:type="dxa" w:w="60"/>
               <w:left w:type="dxa" w:w="80"/>
@@ -4859,7 +4970,7 @@
         </w:tc>
         <w:tc>
           <w:tcPr>
-            <w:tcW w:type="dxa" w:w="902"/>
+            <w:tcW w:type="dxa" w:w="820"/>
             <w:tcMar>
               <w:top w:type="dxa" w:w="60"/>
               <w:left w:type="dxa" w:w="80"/>
@@ -4884,7 +4995,32 @@
         </w:tc>
         <w:tc>
           <w:tcPr>
-            <w:tcW w:type="dxa" w:w="902"/>
+            <w:tcW w:type="dxa" w:w="820"/>
+            <w:tcMar>
+              <w:top w:type="dxa" w:w="60"/>
+              <w:left w:type="dxa" w:w="80"/>
+              <w:bottom w:type="dxa" w:w="60"/>
+              <w:right w:type="dxa" w:w="80"/>
+            </w:tcMar>
+          </w:tcPr>
+          <w:p>
+            <w:pPr>
+              <w:spacing w:after="0" w:line="240"/>
+            </w:pPr>
+            <w:r>
+              <w:rPr>
+                <w:b w:val="false"/>
+                <w:bCs w:val="false"/>
+                <w:sz w:val="18"/>
+                <w:szCs w:val="18"/>
+              </w:rPr>
+              <w:t xml:space="preserve">0.1</w:t>
+            </w:r>
+          </w:p>
+        </w:tc>
+        <w:tc>
+          <w:tcPr>
+            <w:tcW w:type="dxa" w:w="820"/>
             <w:tcMar>
               <w:top w:type="dxa" w:w="60"/>
               <w:left w:type="dxa" w:w="80"/>
@@ -4909,7 +5045,7 @@
         </w:tc>
         <w:tc>
           <w:tcPr>
-            <w:tcW w:type="dxa" w:w="902"/>
+            <w:tcW w:type="dxa" w:w="820"/>
             <w:tcMar>
               <w:top w:type="dxa" w:w="60"/>
               <w:left w:type="dxa" w:w="80"/>
@@ -4934,7 +5070,7 @@
         </w:tc>
         <w:tc>
           <w:tcPr>
-            <w:tcW w:type="dxa" w:w="902"/>
+            <w:tcW w:type="dxa" w:w="820"/>
             <w:tcMar>
               <w:top w:type="dxa" w:w="60"/>
               <w:left w:type="dxa" w:w="80"/>
@@ -4959,7 +5095,7 @@
         </w:tc>
         <w:tc>
           <w:tcPr>
-            <w:tcW w:type="dxa" w:w="902"/>
+            <w:tcW w:type="dxa" w:w="820"/>
             <w:tcMar>
               <w:top w:type="dxa" w:w="60"/>
               <w:left w:type="dxa" w:w="80"/>
@@ -4984,7 +5120,7 @@
         </w:tc>
         <w:tc>
           <w:tcPr>
-            <w:tcW w:type="dxa" w:w="908"/>
+            <w:tcW w:type="dxa" w:w="826"/>
             <w:tcMar>
               <w:top w:type="dxa" w:w="60"/>
               <w:left w:type="dxa" w:w="80"/>
@@ -5014,7 +5150,7 @@
         </w:trPr>
         <w:tc>
           <w:tcPr>
-            <w:tcW w:type="dxa" w:w="902"/>
+            <w:tcW w:type="dxa" w:w="820"/>
             <w:tcMar>
               <w:top w:type="dxa" w:w="60"/>
               <w:left w:type="dxa" w:w="80"/>
@@ -5039,7 +5175,7 @@
         </w:tc>
         <w:tc>
           <w:tcPr>
-            <w:tcW w:type="dxa" w:w="902"/>
+            <w:tcW w:type="dxa" w:w="820"/>
             <w:tcMar>
               <w:top w:type="dxa" w:w="60"/>
               <w:left w:type="dxa" w:w="80"/>
@@ -5064,7 +5200,7 @@
         </w:tc>
         <w:tc>
           <w:tcPr>
-            <w:tcW w:type="dxa" w:w="902"/>
+            <w:tcW w:type="dxa" w:w="820"/>
             <w:tcMar>
               <w:top w:type="dxa" w:w="60"/>
               <w:left w:type="dxa" w:w="80"/>
@@ -5089,7 +5225,7 @@
         </w:tc>
         <w:tc>
           <w:tcPr>
-            <w:tcW w:type="dxa" w:w="902"/>
+            <w:tcW w:type="dxa" w:w="820"/>
             <w:tcMar>
               <w:top w:type="dxa" w:w="60"/>
               <w:left w:type="dxa" w:w="80"/>
@@ -5114,7 +5250,7 @@
         </w:tc>
         <w:tc>
           <w:tcPr>
-            <w:tcW w:type="dxa" w:w="902"/>
+            <w:tcW w:type="dxa" w:w="820"/>
             <w:tcMar>
               <w:top w:type="dxa" w:w="60"/>
               <w:left w:type="dxa" w:w="80"/>
@@ -5139,7 +5275,7 @@
         </w:tc>
         <w:tc>
           <w:tcPr>
-            <w:tcW w:type="dxa" w:w="902"/>
+            <w:tcW w:type="dxa" w:w="820"/>
             <w:tcMar>
               <w:top w:type="dxa" w:w="60"/>
               <w:left w:type="dxa" w:w="80"/>
@@ -5164,7 +5300,7 @@
         </w:tc>
         <w:tc>
           <w:tcPr>
-            <w:tcW w:type="dxa" w:w="902"/>
+            <w:tcW w:type="dxa" w:w="820"/>
             <w:tcMar>
               <w:top w:type="dxa" w:w="60"/>
               <w:left w:type="dxa" w:w="80"/>
@@ -5189,7 +5325,7 @@
         </w:tc>
         <w:tc>
           <w:tcPr>
-            <w:tcW w:type="dxa" w:w="902"/>
+            <w:tcW w:type="dxa" w:w="820"/>
             <w:tcMar>
               <w:top w:type="dxa" w:w="60"/>
               <w:left w:type="dxa" w:w="80"/>
@@ -5214,7 +5350,7 @@
         </w:tc>
         <w:tc>
           <w:tcPr>
-            <w:tcW w:type="dxa" w:w="902"/>
+            <w:tcW w:type="dxa" w:w="820"/>
             <w:tcMar>
               <w:top w:type="dxa" w:w="60"/>
               <w:left w:type="dxa" w:w="80"/>
@@ -5239,7 +5375,32 @@
         </w:tc>
         <w:tc>
           <w:tcPr>
-            <w:tcW w:type="dxa" w:w="908"/>
+            <w:tcW w:type="dxa" w:w="820"/>
+            <w:tcMar>
+              <w:top w:type="dxa" w:w="60"/>
+              <w:left w:type="dxa" w:w="80"/>
+              <w:bottom w:type="dxa" w:w="60"/>
+              <w:right w:type="dxa" w:w="80"/>
+            </w:tcMar>
+          </w:tcPr>
+          <w:p>
+            <w:pPr>
+              <w:spacing w:after="0" w:line="240"/>
+            </w:pPr>
+            <w:r>
+              <w:rPr>
+                <w:b/>
+                <w:bCs/>
+                <w:sz w:val="18"/>
+                <w:szCs w:val="18"/>
+              </w:rPr>
+              <w:t xml:space="preserve"/>
+            </w:r>
+          </w:p>
+        </w:tc>
+        <w:tc>
+          <w:tcPr>
+            <w:tcW w:type="dxa" w:w="826"/>
             <w:tcMar>
               <w:top w:type="dxa" w:w="60"/>
               <w:left w:type="dxa" w:w="80"/>
@@ -5269,7 +5430,7 @@
         </w:trPr>
         <w:tc>
           <w:tcPr>
-            <w:tcW w:type="dxa" w:w="902"/>
+            <w:tcW w:type="dxa" w:w="820"/>
             <w:tcMar>
               <w:top w:type="dxa" w:w="60"/>
               <w:left w:type="dxa" w:w="80"/>
@@ -5294,7 +5455,7 @@
         </w:tc>
         <w:tc>
           <w:tcPr>
-            <w:tcW w:type="dxa" w:w="902"/>
+            <w:tcW w:type="dxa" w:w="820"/>
             <w:tcMar>
               <w:top w:type="dxa" w:w="60"/>
               <w:left w:type="dxa" w:w="80"/>
@@ -5319,7 +5480,7 @@
         </w:tc>
         <w:tc>
           <w:tcPr>
-            <w:tcW w:type="dxa" w:w="902"/>
+            <w:tcW w:type="dxa" w:w="820"/>
             <w:tcMar>
               <w:top w:type="dxa" w:w="60"/>
               <w:left w:type="dxa" w:w="80"/>
@@ -5344,7 +5505,7 @@
         </w:tc>
         <w:tc>
           <w:tcPr>
-            <w:tcW w:type="dxa" w:w="902"/>
+            <w:tcW w:type="dxa" w:w="820"/>
             <w:tcMar>
               <w:top w:type="dxa" w:w="60"/>
               <w:left w:type="dxa" w:w="80"/>
@@ -5369,7 +5530,7 @@
         </w:tc>
         <w:tc>
           <w:tcPr>
-            <w:tcW w:type="dxa" w:w="902"/>
+            <w:tcW w:type="dxa" w:w="820"/>
             <w:tcMar>
               <w:top w:type="dxa" w:w="60"/>
               <w:left w:type="dxa" w:w="80"/>
@@ -5394,7 +5555,32 @@
         </w:tc>
         <w:tc>
           <w:tcPr>
-            <w:tcW w:type="dxa" w:w="902"/>
+            <w:tcW w:type="dxa" w:w="820"/>
+            <w:tcMar>
+              <w:top w:type="dxa" w:w="60"/>
+              <w:left w:type="dxa" w:w="80"/>
+              <w:bottom w:type="dxa" w:w="60"/>
+              <w:right w:type="dxa" w:w="80"/>
+            </w:tcMar>
+          </w:tcPr>
+          <w:p>
+            <w:pPr>
+              <w:spacing w:after="0" w:line="240"/>
+            </w:pPr>
+            <w:r>
+              <w:rPr>
+                <w:b w:val="false"/>
+                <w:bCs w:val="false"/>
+                <w:sz w:val="18"/>
+                <w:szCs w:val="18"/>
+              </w:rPr>
+              <w:t xml:space="preserve">45.7</w:t>
+            </w:r>
+          </w:p>
+        </w:tc>
+        <w:tc>
+          <w:tcPr>
+            <w:tcW w:type="dxa" w:w="820"/>
             <w:tcMar>
               <w:top w:type="dxa" w:w="60"/>
               <w:left w:type="dxa" w:w="80"/>
@@ -5419,7 +5605,7 @@
         </w:tc>
         <w:tc>
           <w:tcPr>
-            <w:tcW w:type="dxa" w:w="902"/>
+            <w:tcW w:type="dxa" w:w="820"/>
             <w:tcMar>
               <w:top w:type="dxa" w:w="60"/>
               <w:left w:type="dxa" w:w="80"/>
@@ -5444,7 +5630,7 @@
         </w:tc>
         <w:tc>
           <w:tcPr>
-            <w:tcW w:type="dxa" w:w="902"/>
+            <w:tcW w:type="dxa" w:w="820"/>
             <w:tcMar>
               <w:top w:type="dxa" w:w="60"/>
               <w:left w:type="dxa" w:w="80"/>
@@ -5469,7 +5655,7 @@
         </w:tc>
         <w:tc>
           <w:tcPr>
-            <w:tcW w:type="dxa" w:w="902"/>
+            <w:tcW w:type="dxa" w:w="820"/>
             <w:tcMar>
               <w:top w:type="dxa" w:w="60"/>
               <w:left w:type="dxa" w:w="80"/>
@@ -5494,7 +5680,7 @@
         </w:tc>
         <w:tc>
           <w:tcPr>
-            <w:tcW w:type="dxa" w:w="908"/>
+            <w:tcW w:type="dxa" w:w="826"/>
             <w:tcMar>
               <w:top w:type="dxa" w:w="60"/>
               <w:left w:type="dxa" w:w="80"/>
@@ -5524,7 +5710,7 @@
         </w:trPr>
         <w:tc>
           <w:tcPr>
-            <w:tcW w:type="dxa" w:w="902"/>
+            <w:tcW w:type="dxa" w:w="820"/>
             <w:tcMar>
               <w:top w:type="dxa" w:w="60"/>
               <w:left w:type="dxa" w:w="80"/>
@@ -5549,7 +5735,7 @@
         </w:tc>
         <w:tc>
           <w:tcPr>
-            <w:tcW w:type="dxa" w:w="902"/>
+            <w:tcW w:type="dxa" w:w="820"/>
             <w:tcMar>
               <w:top w:type="dxa" w:w="60"/>
               <w:left w:type="dxa" w:w="80"/>
@@ -5574,7 +5760,7 @@
         </w:tc>
         <w:tc>
           <w:tcPr>
-            <w:tcW w:type="dxa" w:w="902"/>
+            <w:tcW w:type="dxa" w:w="820"/>
             <w:tcMar>
               <w:top w:type="dxa" w:w="60"/>
               <w:left w:type="dxa" w:w="80"/>
@@ -5599,7 +5785,7 @@
         </w:tc>
         <w:tc>
           <w:tcPr>
-            <w:tcW w:type="dxa" w:w="902"/>
+            <w:tcW w:type="dxa" w:w="820"/>
             <w:tcMar>
               <w:top w:type="dxa" w:w="60"/>
               <w:left w:type="dxa" w:w="80"/>
@@ -5624,7 +5810,7 @@
         </w:tc>
         <w:tc>
           <w:tcPr>
-            <w:tcW w:type="dxa" w:w="902"/>
+            <w:tcW w:type="dxa" w:w="820"/>
             <w:tcMar>
               <w:top w:type="dxa" w:w="60"/>
               <w:left w:type="dxa" w:w="80"/>
@@ -5649,7 +5835,32 @@
         </w:tc>
         <w:tc>
           <w:tcPr>
-            <w:tcW w:type="dxa" w:w="902"/>
+            <w:tcW w:type="dxa" w:w="820"/>
+            <w:tcMar>
+              <w:top w:type="dxa" w:w="60"/>
+              <w:left w:type="dxa" w:w="80"/>
+              <w:bottom w:type="dxa" w:w="60"/>
+              <w:right w:type="dxa" w:w="80"/>
+            </w:tcMar>
+          </w:tcPr>
+          <w:p>
+            <w:pPr>
+              <w:spacing w:after="0" w:line="240"/>
+            </w:pPr>
+            <w:r>
+              <w:rPr>
+                <w:b w:val="false"/>
+                <w:bCs w:val="false"/>
+                <w:sz w:val="18"/>
+                <w:szCs w:val="18"/>
+              </w:rPr>
+              <w:t xml:space="preserve">24.9</w:t>
+            </w:r>
+          </w:p>
+        </w:tc>
+        <w:tc>
+          <w:tcPr>
+            <w:tcW w:type="dxa" w:w="820"/>
             <w:tcMar>
               <w:top w:type="dxa" w:w="60"/>
               <w:left w:type="dxa" w:w="80"/>
@@ -5674,7 +5885,7 @@
         </w:tc>
         <w:tc>
           <w:tcPr>
-            <w:tcW w:type="dxa" w:w="902"/>
+            <w:tcW w:type="dxa" w:w="820"/>
             <w:tcMar>
               <w:top w:type="dxa" w:w="60"/>
               <w:left w:type="dxa" w:w="80"/>
@@ -5699,7 +5910,7 @@
         </w:tc>
         <w:tc>
           <w:tcPr>
-            <w:tcW w:type="dxa" w:w="902"/>
+            <w:tcW w:type="dxa" w:w="820"/>
             <w:tcMar>
               <w:top w:type="dxa" w:w="60"/>
               <w:left w:type="dxa" w:w="80"/>
@@ -5724,7 +5935,7 @@
         </w:tc>
         <w:tc>
           <w:tcPr>
-            <w:tcW w:type="dxa" w:w="902"/>
+            <w:tcW w:type="dxa" w:w="820"/>
             <w:tcMar>
               <w:top w:type="dxa" w:w="60"/>
               <w:left w:type="dxa" w:w="80"/>
@@ -5749,7 +5960,7 @@
         </w:tc>
         <w:tc>
           <w:tcPr>
-            <w:tcW w:type="dxa" w:w="908"/>
+            <w:tcW w:type="dxa" w:w="826"/>
             <w:tcMar>
               <w:top w:type="dxa" w:w="60"/>
               <w:left w:type="dxa" w:w="80"/>
@@ -5779,7 +5990,7 @@
         </w:trPr>
         <w:tc>
           <w:tcPr>
-            <w:tcW w:type="dxa" w:w="902"/>
+            <w:tcW w:type="dxa" w:w="820"/>
             <w:tcMar>
               <w:top w:type="dxa" w:w="60"/>
               <w:left w:type="dxa" w:w="80"/>
@@ -5804,7 +6015,7 @@
         </w:tc>
         <w:tc>
           <w:tcPr>
-            <w:tcW w:type="dxa" w:w="902"/>
+            <w:tcW w:type="dxa" w:w="820"/>
             <w:tcMar>
               <w:top w:type="dxa" w:w="60"/>
               <w:left w:type="dxa" w:w="80"/>
@@ -5829,7 +6040,7 @@
         </w:tc>
         <w:tc>
           <w:tcPr>
-            <w:tcW w:type="dxa" w:w="902"/>
+            <w:tcW w:type="dxa" w:w="820"/>
             <w:tcMar>
               <w:top w:type="dxa" w:w="60"/>
               <w:left w:type="dxa" w:w="80"/>
@@ -5854,7 +6065,7 @@
         </w:tc>
         <w:tc>
           <w:tcPr>
-            <w:tcW w:type="dxa" w:w="902"/>
+            <w:tcW w:type="dxa" w:w="820"/>
             <w:tcMar>
               <w:top w:type="dxa" w:w="60"/>
               <w:left w:type="dxa" w:w="80"/>
@@ -5879,7 +6090,7 @@
         </w:tc>
         <w:tc>
           <w:tcPr>
-            <w:tcW w:type="dxa" w:w="902"/>
+            <w:tcW w:type="dxa" w:w="820"/>
             <w:tcMar>
               <w:top w:type="dxa" w:w="60"/>
               <w:left w:type="dxa" w:w="80"/>
@@ -5904,7 +6115,32 @@
         </w:tc>
         <w:tc>
           <w:tcPr>
-            <w:tcW w:type="dxa" w:w="902"/>
+            <w:tcW w:type="dxa" w:w="820"/>
+            <w:tcMar>
+              <w:top w:type="dxa" w:w="60"/>
+              <w:left w:type="dxa" w:w="80"/>
+              <w:bottom w:type="dxa" w:w="60"/>
+              <w:right w:type="dxa" w:w="80"/>
+            </w:tcMar>
+          </w:tcPr>
+          <w:p>
+            <w:pPr>
+              <w:spacing w:after="0" w:line="240"/>
+            </w:pPr>
+            <w:r>
+              <w:rPr>
+                <w:b w:val="false"/>
+                <w:bCs w:val="false"/>
+                <w:sz w:val="18"/>
+                <w:szCs w:val="18"/>
+              </w:rPr>
+              <w:t xml:space="preserve">9.9</w:t>
+            </w:r>
+          </w:p>
+        </w:tc>
+        <w:tc>
+          <w:tcPr>
+            <w:tcW w:type="dxa" w:w="820"/>
             <w:tcMar>
               <w:top w:type="dxa" w:w="60"/>
               <w:left w:type="dxa" w:w="80"/>
@@ -5929,7 +6165,7 @@
         </w:tc>
         <w:tc>
           <w:tcPr>
-            <w:tcW w:type="dxa" w:w="902"/>
+            <w:tcW w:type="dxa" w:w="820"/>
             <w:tcMar>
               <w:top w:type="dxa" w:w="60"/>
               <w:left w:type="dxa" w:w="80"/>
@@ -5954,7 +6190,7 @@
         </w:tc>
         <w:tc>
           <w:tcPr>
-            <w:tcW w:type="dxa" w:w="902"/>
+            <w:tcW w:type="dxa" w:w="820"/>
             <w:tcMar>
               <w:top w:type="dxa" w:w="60"/>
               <w:left w:type="dxa" w:w="80"/>
@@ -5979,7 +6215,7 @@
         </w:tc>
         <w:tc>
           <w:tcPr>
-            <w:tcW w:type="dxa" w:w="902"/>
+            <w:tcW w:type="dxa" w:w="820"/>
             <w:tcMar>
               <w:top w:type="dxa" w:w="60"/>
               <w:left w:type="dxa" w:w="80"/>
@@ -6004,7 +6240,7 @@
         </w:tc>
         <w:tc>
           <w:tcPr>
-            <w:tcW w:type="dxa" w:w="908"/>
+            <w:tcW w:type="dxa" w:w="826"/>
             <w:tcMar>
               <w:top w:type="dxa" w:w="60"/>
               <w:left w:type="dxa" w:w="80"/>
@@ -6034,7 +6270,7 @@
         </w:trPr>
         <w:tc>
           <w:tcPr>
-            <w:tcW w:type="dxa" w:w="902"/>
+            <w:tcW w:type="dxa" w:w="820"/>
             <w:tcMar>
               <w:top w:type="dxa" w:w="60"/>
               <w:left w:type="dxa" w:w="80"/>
@@ -6059,7 +6295,7 @@
         </w:tc>
         <w:tc>
           <w:tcPr>
-            <w:tcW w:type="dxa" w:w="902"/>
+            <w:tcW w:type="dxa" w:w="820"/>
             <w:tcMar>
               <w:top w:type="dxa" w:w="60"/>
               <w:left w:type="dxa" w:w="80"/>
@@ -6084,7 +6320,7 @@
         </w:tc>
         <w:tc>
           <w:tcPr>
-            <w:tcW w:type="dxa" w:w="902"/>
+            <w:tcW w:type="dxa" w:w="820"/>
             <w:tcMar>
               <w:top w:type="dxa" w:w="60"/>
               <w:left w:type="dxa" w:w="80"/>
@@ -6109,7 +6345,7 @@
         </w:tc>
         <w:tc>
           <w:tcPr>
-            <w:tcW w:type="dxa" w:w="902"/>
+            <w:tcW w:type="dxa" w:w="820"/>
             <w:tcMar>
               <w:top w:type="dxa" w:w="60"/>
               <w:left w:type="dxa" w:w="80"/>
@@ -6134,7 +6370,7 @@
         </w:tc>
         <w:tc>
           <w:tcPr>
-            <w:tcW w:type="dxa" w:w="902"/>
+            <w:tcW w:type="dxa" w:w="820"/>
             <w:tcMar>
               <w:top w:type="dxa" w:w="60"/>
               <w:left w:type="dxa" w:w="80"/>
@@ -6159,7 +6395,32 @@
         </w:tc>
         <w:tc>
           <w:tcPr>
-            <w:tcW w:type="dxa" w:w="902"/>
+            <w:tcW w:type="dxa" w:w="820"/>
+            <w:tcMar>
+              <w:top w:type="dxa" w:w="60"/>
+              <w:left w:type="dxa" w:w="80"/>
+              <w:bottom w:type="dxa" w:w="60"/>
+              <w:right w:type="dxa" w:w="80"/>
+            </w:tcMar>
+          </w:tcPr>
+          <w:p>
+            <w:pPr>
+              <w:spacing w:after="0" w:line="240"/>
+            </w:pPr>
+            <w:r>
+              <w:rPr>
+                <w:b w:val="false"/>
+                <w:bCs w:val="false"/>
+                <w:sz w:val="18"/>
+                <w:szCs w:val="18"/>
+              </w:rPr>
+              <w:t xml:space="preserve">2.9</w:t>
+            </w:r>
+          </w:p>
+        </w:tc>
+        <w:tc>
+          <w:tcPr>
+            <w:tcW w:type="dxa" w:w="820"/>
             <w:tcMar>
               <w:top w:type="dxa" w:w="60"/>
               <w:left w:type="dxa" w:w="80"/>
@@ -6184,7 +6445,7 @@
         </w:tc>
         <w:tc>
           <w:tcPr>
-            <w:tcW w:type="dxa" w:w="902"/>
+            <w:tcW w:type="dxa" w:w="820"/>
             <w:tcMar>
               <w:top w:type="dxa" w:w="60"/>
               <w:left w:type="dxa" w:w="80"/>
@@ -6209,7 +6470,7 @@
         </w:tc>
         <w:tc>
           <w:tcPr>
-            <w:tcW w:type="dxa" w:w="902"/>
+            <w:tcW w:type="dxa" w:w="820"/>
             <w:tcMar>
               <w:top w:type="dxa" w:w="60"/>
               <w:left w:type="dxa" w:w="80"/>
@@ -6234,7 +6495,7 @@
         </w:tc>
         <w:tc>
           <w:tcPr>
-            <w:tcW w:type="dxa" w:w="902"/>
+            <w:tcW w:type="dxa" w:w="820"/>
             <w:tcMar>
               <w:top w:type="dxa" w:w="60"/>
               <w:left w:type="dxa" w:w="80"/>
@@ -6259,7 +6520,7 @@
         </w:tc>
         <w:tc>
           <w:tcPr>
-            <w:tcW w:type="dxa" w:w="908"/>
+            <w:tcW w:type="dxa" w:w="826"/>
             <w:tcMar>
               <w:top w:type="dxa" w:w="60"/>
               <w:left w:type="dxa" w:w="80"/>
@@ -6294,6 +6555,22 @@
         <w:spacing w:after="160" w:line="320"/>
       </w:pPr>
       <w:r>
+        <w:t xml:space="preserve">Costs are 2024 HUF, net of VAT. Printing is charged per printed page at 7 HUF, so duplex printing halves sheets but not pages and saves no toner. Handling time covers referrals and diagnostic reports at 30 s per document and is reported as displaced capacity, not costed. Greenhouse-gas emissions are cradle-to-gate for paper manufacture at 950 kg CO2e per tonne and exclude printing energy and end-of-life disposal. Property value is the capital immobilised by the archive at steady state under statutory retention, not an annual rent. Full cost components are given in supplementary table S1.</w:t>
+      </w:r>
+    </w:p>
+    <w:p>
+      <w:pPr>
+        <w:spacing w:after="160" w:line="320"/>
+      </w:pPr>
+      <w:r>
+        <w:t xml:space="preserve">Costs are 2024 HUF, net of VAT. Printing is charged per printed page at 7 HUF, so duplex printing halves sheets but not pages and saves no toner. Handling time covers referrals and diagnostic reports at 30 s per document and is reported as displaced capacity, not costed. Greenhouse-gas emissions are cradle-to-gate for paper manufacture at 950 kg CO2e per tonne and exclude printing energy and end-of-life disposal. Property value is the capital immobilised by the archive at steady state under statutory retention, not an annual rent. Full cost components are given in supplementary table S1.</w:t>
+      </w:r>
+    </w:p>
+    <w:p>
+      <w:pPr>
+        <w:spacing w:after="160" w:line="320"/>
+      </w:pPr>
+      <w:r>
         <w:t xml:space="preserve">Costs are 2024 HUF, net of VAT. Printing is charged per printed page at 7 HUF, so duplex printing halves sheets but not pages and saves no toner. Handling time covers referrals and diagnostic reports at 30 s per document and is reported as displaced capacity, not costed. Property value is the capital immobilised by the archive at steady state under statutory retention, not an annual rent. Full cost components are given in supplementary table S1.</w:t>
       </w:r>
     </w:p>
@@ -6381,14 +6658,6 @@
       </w:r>
       <w:r>
         <w:t xml:space="preserve"> One-way sensitivity analysis of the steady-state immobilised property value</w:t>
-      </w:r>
-    </w:p>
-    <w:p>
-      <w:pPr>
-        <w:spacing w:after="160" w:line="320"/>
-      </w:pPr>
-      <w:r>
-        <w:t xml:space="preserve">Steady-state immobilised property value, national. Base case 8.97 bn HUF.</w:t>
       </w:r>
     </w:p>
     <w:tbl>
@@ -6404,11 +6673,10 @@
         </w:tblBorders>
       </w:tblPr>
       <w:tblGrid>
-        <w:gridCol w:w="1805"/>
-        <w:gridCol w:w="1805"/>
-        <w:gridCol w:w="1805"/>
-        <w:gridCol w:w="1805"/>
-        <w:gridCol w:w="1806"/>
+        <w:gridCol w:w="2256"/>
+        <w:gridCol w:w="2256"/>
+        <w:gridCol w:w="2256"/>
+        <w:gridCol w:w="2258"/>
       </w:tblGrid>
       <w:tr>
         <w:trPr>
@@ -6416,7 +6684,7 @@
         </w:trPr>
         <w:tc>
           <w:tcPr>
-            <w:tcW w:type="dxa" w:w="1805"/>
+            <w:tcW w:type="dxa" w:w="2256"/>
             <w:shd w:fill="F2F2F2" w:val="clear"/>
             <w:tcMar>
               <w:top w:type="dxa" w:w="60"/>
@@ -6442,7 +6710,7 @@
         </w:tc>
         <w:tc>
           <w:tcPr>
-            <w:tcW w:type="dxa" w:w="1805"/>
+            <w:tcW w:type="dxa" w:w="2256"/>
             <w:shd w:fill="F2F2F2" w:val="clear"/>
             <w:tcMar>
               <w:top w:type="dxa" w:w="60"/>
@@ -6468,7 +6736,7 @@
         </w:tc>
         <w:tc>
           <w:tcPr>
-            <w:tcW w:type="dxa" w:w="1805"/>
+            <w:tcW w:type="dxa" w:w="2256"/>
             <w:shd w:fill="F2F2F2" w:val="clear"/>
             <w:tcMar>
               <w:top w:type="dxa" w:w="60"/>
@@ -6494,7 +6762,7 @@
         </w:tc>
         <w:tc>
           <w:tcPr>
-            <w:tcW w:type="dxa" w:w="1805"/>
+            <w:tcW w:type="dxa" w:w="2258"/>
             <w:shd w:fill="F2F2F2" w:val="clear"/>
             <w:tcMar>
               <w:top w:type="dxa" w:w="60"/>
@@ -6515,32 +6783,6 @@
                 <w:szCs w:val="18"/>
               </w:rPr>
               <w:t xml:space="preserve">Swing</w:t>
-            </w:r>
-          </w:p>
-        </w:tc>
-        <w:tc>
-          <w:tcPr>
-            <w:tcW w:type="dxa" w:w="1806"/>
-            <w:shd w:fill="F2F2F2" w:val="clear"/>
-            <w:tcMar>
-              <w:top w:type="dxa" w:w="60"/>
-              <w:left w:type="dxa" w:w="80"/>
-              <w:bottom w:type="dxa" w:w="60"/>
-              <w:right w:type="dxa" w:w="80"/>
-            </w:tcMar>
-          </w:tcPr>
-          <w:p>
-            <w:pPr>
-              <w:spacing w:after="0" w:line="240"/>
-            </w:pPr>
-            <w:r>
-              <w:rPr>
-                <w:b/>
-                <w:bCs/>
-                <w:sz w:val="18"/>
-                <w:szCs w:val="18"/>
-              </w:rPr>
-              <w:t xml:space="preserve"/>
             </w:r>
           </w:p>
         </w:tc>
@@ -6551,7 +6793,7 @@
         </w:trPr>
         <w:tc>
           <w:tcPr>
-            <w:tcW w:type="dxa" w:w="1805"/>
+            <w:tcW w:type="dxa" w:w="2256"/>
             <w:tcMar>
               <w:top w:type="dxa" w:w="60"/>
               <w:left w:type="dxa" w:w="80"/>
@@ -6576,7 +6818,7 @@
         </w:tc>
         <w:tc>
           <w:tcPr>
-            <w:tcW w:type="dxa" w:w="1805"/>
+            <w:tcW w:type="dxa" w:w="2256"/>
             <w:tcMar>
               <w:top w:type="dxa" w:w="60"/>
               <w:left w:type="dxa" w:w="80"/>
@@ -6601,7 +6843,7 @@
         </w:tc>
         <w:tc>
           <w:tcPr>
-            <w:tcW w:type="dxa" w:w="1805"/>
+            <w:tcW w:type="dxa" w:w="2256"/>
             <w:tcMar>
               <w:top w:type="dxa" w:w="60"/>
               <w:left w:type="dxa" w:w="80"/>
@@ -6626,7 +6868,7 @@
         </w:tc>
         <w:tc>
           <w:tcPr>
-            <w:tcW w:type="dxa" w:w="1805"/>
+            <w:tcW w:type="dxa" w:w="2258"/>
             <w:tcMar>
               <w:top w:type="dxa" w:w="60"/>
               <w:left w:type="dxa" w:w="80"/>
@@ -6646,31 +6888,6 @@
                 <w:szCs w:val="18"/>
               </w:rPr>
               <w:t xml:space="preserve">5.29 bn</w:t>
-            </w:r>
-          </w:p>
-        </w:tc>
-        <w:tc>
-          <w:tcPr>
-            <w:tcW w:type="dxa" w:w="1806"/>
-            <w:tcMar>
-              <w:top w:type="dxa" w:w="60"/>
-              <w:left w:type="dxa" w:w="80"/>
-              <w:bottom w:type="dxa" w:w="60"/>
-              <w:right w:type="dxa" w:w="80"/>
-            </w:tcMar>
-          </w:tcPr>
-          <w:p>
-            <w:pPr>
-              <w:spacing w:after="0" w:line="240"/>
-            </w:pPr>
-            <w:r>
-              <w:rPr>
-                <w:b w:val="false"/>
-                <w:bCs w:val="false"/>
-                <w:sz w:val="18"/>
-                <w:szCs w:val="18"/>
-              </w:rPr>
-              <w:t xml:space="preserve"/>
             </w:r>
           </w:p>
         </w:tc>
@@ -6681,7 +6898,7 @@
         </w:trPr>
         <w:tc>
           <w:tcPr>
-            <w:tcW w:type="dxa" w:w="1805"/>
+            <w:tcW w:type="dxa" w:w="2256"/>
             <w:tcMar>
               <w:top w:type="dxa" w:w="60"/>
               <w:left w:type="dxa" w:w="80"/>
@@ -6706,7 +6923,7 @@
         </w:tc>
         <w:tc>
           <w:tcPr>
-            <w:tcW w:type="dxa" w:w="1805"/>
+            <w:tcW w:type="dxa" w:w="2256"/>
             <w:tcMar>
               <w:top w:type="dxa" w:w="60"/>
               <w:left w:type="dxa" w:w="80"/>
@@ -6731,7 +6948,7 @@
         </w:tc>
         <w:tc>
           <w:tcPr>
-            <w:tcW w:type="dxa" w:w="1805"/>
+            <w:tcW w:type="dxa" w:w="2256"/>
             <w:tcMar>
               <w:top w:type="dxa" w:w="60"/>
               <w:left w:type="dxa" w:w="80"/>
@@ -6756,7 +6973,7 @@
         </w:tc>
         <w:tc>
           <w:tcPr>
-            <w:tcW w:type="dxa" w:w="1805"/>
+            <w:tcW w:type="dxa" w:w="2258"/>
             <w:tcMar>
               <w:top w:type="dxa" w:w="60"/>
               <w:left w:type="dxa" w:w="80"/>
@@ -6776,31 +6993,6 @@
                 <w:szCs w:val="18"/>
               </w:rPr>
               <w:t xml:space="preserve">4.03 bn</w:t>
-            </w:r>
-          </w:p>
-        </w:tc>
-        <w:tc>
-          <w:tcPr>
-            <w:tcW w:type="dxa" w:w="1806"/>
-            <w:tcMar>
-              <w:top w:type="dxa" w:w="60"/>
-              <w:left w:type="dxa" w:w="80"/>
-              <w:bottom w:type="dxa" w:w="60"/>
-              <w:right w:type="dxa" w:w="80"/>
-            </w:tcMar>
-          </w:tcPr>
-          <w:p>
-            <w:pPr>
-              <w:spacing w:after="0" w:line="240"/>
-            </w:pPr>
-            <w:r>
-              <w:rPr>
-                <w:b w:val="false"/>
-                <w:bCs w:val="false"/>
-                <w:sz w:val="18"/>
-                <w:szCs w:val="18"/>
-              </w:rPr>
-              <w:t xml:space="preserve"/>
             </w:r>
           </w:p>
         </w:tc>
@@ -6811,7 +7003,7 @@
         </w:trPr>
         <w:tc>
           <w:tcPr>
-            <w:tcW w:type="dxa" w:w="1805"/>
+            <w:tcW w:type="dxa" w:w="2256"/>
             <w:tcMar>
               <w:top w:type="dxa" w:w="60"/>
               <w:left w:type="dxa" w:w="80"/>
@@ -6836,7 +7028,7 @@
         </w:tc>
         <w:tc>
           <w:tcPr>
-            <w:tcW w:type="dxa" w:w="1805"/>
+            <w:tcW w:type="dxa" w:w="2256"/>
             <w:tcMar>
               <w:top w:type="dxa" w:w="60"/>
               <w:left w:type="dxa" w:w="80"/>
@@ -6861,7 +7053,7 @@
         </w:tc>
         <w:tc>
           <w:tcPr>
-            <w:tcW w:type="dxa" w:w="1805"/>
+            <w:tcW w:type="dxa" w:w="2256"/>
             <w:tcMar>
               <w:top w:type="dxa" w:w="60"/>
               <w:left w:type="dxa" w:w="80"/>
@@ -6886,7 +7078,7 @@
         </w:tc>
         <w:tc>
           <w:tcPr>
-            <w:tcW w:type="dxa" w:w="1805"/>
+            <w:tcW w:type="dxa" w:w="2258"/>
             <w:tcMar>
               <w:top w:type="dxa" w:w="60"/>
               <w:left w:type="dxa" w:w="80"/>
@@ -6906,31 +7098,6 @@
                 <w:szCs w:val="18"/>
               </w:rPr>
               <w:t xml:space="preserve">3.74 bn</w:t>
-            </w:r>
-          </w:p>
-        </w:tc>
-        <w:tc>
-          <w:tcPr>
-            <w:tcW w:type="dxa" w:w="1806"/>
-            <w:tcMar>
-              <w:top w:type="dxa" w:w="60"/>
-              <w:left w:type="dxa" w:w="80"/>
-              <w:bottom w:type="dxa" w:w="60"/>
-              <w:right w:type="dxa" w:w="80"/>
-            </w:tcMar>
-          </w:tcPr>
-          <w:p>
-            <w:pPr>
-              <w:spacing w:after="0" w:line="240"/>
-            </w:pPr>
-            <w:r>
-              <w:rPr>
-                <w:b w:val="false"/>
-                <w:bCs w:val="false"/>
-                <w:sz w:val="18"/>
-                <w:szCs w:val="18"/>
-              </w:rPr>
-              <w:t xml:space="preserve"/>
             </w:r>
           </w:p>
         </w:tc>
@@ -6941,7 +7108,7 @@
         </w:trPr>
         <w:tc>
           <w:tcPr>
-            <w:tcW w:type="dxa" w:w="1805"/>
+            <w:tcW w:type="dxa" w:w="2256"/>
             <w:tcMar>
               <w:top w:type="dxa" w:w="60"/>
               <w:left w:type="dxa" w:w="80"/>
@@ -6966,7 +7133,7 @@
         </w:tc>
         <w:tc>
           <w:tcPr>
-            <w:tcW w:type="dxa" w:w="1805"/>
+            <w:tcW w:type="dxa" w:w="2256"/>
             <w:tcMar>
               <w:top w:type="dxa" w:w="60"/>
               <w:left w:type="dxa" w:w="80"/>
@@ -6991,7 +7158,7 @@
         </w:tc>
         <w:tc>
           <w:tcPr>
-            <w:tcW w:type="dxa" w:w="1805"/>
+            <w:tcW w:type="dxa" w:w="2256"/>
             <w:tcMar>
               <w:top w:type="dxa" w:w="60"/>
               <w:left w:type="dxa" w:w="80"/>
@@ -7016,7 +7183,7 @@
         </w:tc>
         <w:tc>
           <w:tcPr>
-            <w:tcW w:type="dxa" w:w="1805"/>
+            <w:tcW w:type="dxa" w:w="2258"/>
             <w:tcMar>
               <w:top w:type="dxa" w:w="60"/>
               <w:left w:type="dxa" w:w="80"/>
@@ -7036,31 +7203,6 @@
                 <w:szCs w:val="18"/>
               </w:rPr>
               <w:t xml:space="preserve">1.74 bn</w:t>
-            </w:r>
-          </w:p>
-        </w:tc>
-        <w:tc>
-          <w:tcPr>
-            <w:tcW w:type="dxa" w:w="1806"/>
-            <w:tcMar>
-              <w:top w:type="dxa" w:w="60"/>
-              <w:left w:type="dxa" w:w="80"/>
-              <w:bottom w:type="dxa" w:w="60"/>
-              <w:right w:type="dxa" w:w="80"/>
-            </w:tcMar>
-          </w:tcPr>
-          <w:p>
-            <w:pPr>
-              <w:spacing w:after="0" w:line="240"/>
-            </w:pPr>
-            <w:r>
-              <w:rPr>
-                <w:b w:val="false"/>
-                <w:bCs w:val="false"/>
-                <w:sz w:val="18"/>
-                <w:szCs w:val="18"/>
-              </w:rPr>
-              <w:t xml:space="preserve">The most influential parameter is shelving density per m² of floor (swing 5.29 billion), followed by property value (4.03 billion), sheets per linear metre (3.74 billion) and annual birth volume (1.74 billion). The ranking matters: the two largest sources of uncertainty are archival conventions we assumed rather than measured, and both should be measured directly before this figure is used in a business case. Even the most favourable corner of the parameter space leaves the tied-up property value above 6.9 billion HUF.</w:t>
             </w:r>
           </w:p>
         </w:tc>
@@ -7070,6 +7212,14 @@
       <w:pPr>
         <w:spacing w:after="200"/>
       </w:pPr>
+    </w:p>
+    <w:p>
+      <w:pPr>
+        <w:spacing w:after="160" w:line="320"/>
+      </w:pPr>
+      <w:r>
+        <w:t xml:space="preserve">National steady-state immobilised property value; base case 8.97 bn HUF. Each parameter is varied alone across the range given in the parameter file, with all others held at base case.</w:t>
+      </w:r>
     </w:p>
     <w:p>
       <w:pPr>

</xml_diff>

<commit_message>
Label the scale on figure 5
Figures 3 and 4 name the national scale in the axis label; figure 5 did
not, leaving the reader to find it in the legend. Both panel titles now
say national, and the legends for figures 1 and 2 state that those values
are per care episode and therefore scale-independent.

Co-Authored-By: Claude Opus 5 <noreply@anthropic.com>
Claude-Session: https://claude.ai/code/session_01SHGvgn1XeZPuGWHj4pB41h
</commit_message>
<xml_diff>
--- a/manuscripts/obstetric-paper-burden/BMJ-HCI-submission.docx
+++ b/manuscripts/obstetric-paper-burden/BMJ-HCI-submission.docx
@@ -7929,7 +7929,7 @@
         <w:t xml:space="preserve">Figure 1.</w:t>
       </w:r>
       <w:r>
-        <w:t xml:space="preserve"> Mean printed pages per care episode by document family, split by document role. Diagnostic reports (solid fill) account for 61.7% of all pages; referrals (hatched) for 13.4%; clinical records (dotted) for 24.9%. Each diagnostic referral generates exactly four report pages.</w:t>
+        <w:t xml:space="preserve"> Mean printed pages per care episode by document family, split by document role. Values are per care episode and therefore independent of departmental or national volume. Diagnostic reports (solid fill) account for 61.7% of all pages; referrals (hatched) for 13.4%; clinical records (dotted) for 24.9%. Each diagnostic referral generates exactly four report pages.</w:t>
       </w:r>
     </w:p>
     <w:p>
@@ -7944,7 +7944,7 @@
         <w:t xml:space="preserve">Figure 2.</w:t>
       </w:r>
       <w:r>
-        <w:t xml:space="preserve"> Distribution of total printed pages per care episode (n = 100). Dashed line, mean 131.3 pages. The distribution is symmetric and narrow (IQR 124 to 138), indicating that documentation volume behaves as a near-fixed cost of the care pathway.</w:t>
+        <w:t xml:space="preserve"> Distribution of total printed pages per care episode in the study sample (n = 100). Dashed line, mean 131.3 pages. The distribution is symmetric and narrow (IQR 124 to 138), indicating that documentation volume behaves as a near-fixed cost of the care pathway.</w:t>
       </w:r>
     </w:p>
     <w:p>

</xml_diff>